<commit_message>
Rewrite Tania Hilburn cover letter: deeply personalized, corrected dates
- BDCC 2025, Little 2020-2023, OD Sep-Dec 2020 (not current)
- References ribbon cutting this month, Simsboro native, LA Tech degree
- References "only rural hub" quote, $110K Home in Monroe with Mount Pleasant CDC
- References Ascent partnership, United Way/Bethune-Oak Park
- References her career path: Health Info degree → ED → MD running 1,000-person campus
- References vault, 75% mortgage servicing, 50→200 employee growth plan

https://claude.ai/code/session_01FDYhPQsySRjVXRDDMYJ3Ar
</commit_message>
<xml_diff>
--- a/Chase_Kinslow_CoverLetter_TaniaHilburn.docx
+++ b/Chase_Kinslow_CoverLetter_TaniaHilburn.docx
@@ -103,7 +103,7 @@
         <w:spacing w:after="40"/>
       </w:pPr>
       <w:r>
-        <w:t>I am writing to apply for the Transactions Specialist II position at the Monroe Operations Center. With a CPA license, a Juris Doctor, and a Bachelor of Accountancy, I have three years of direct experience processing, clearing, and servicing document transactions involving moderately complex tasks — and I am ready to contribute to your team within the structured and supervised environment this role operates in.</w:t>
+        <w:t>Congratulations on the ribbon cutting at the Ruston Operations Center this month. As a fellow North Louisiana native watching Chase grow from the 30-year Monroe campus into a $31 million expansion that you called "the only rural hub" for a firm of this scale — it is clear you are building something that matters here. I am writing to apply for the Transactions Specialist II position because I want to be part of the operation you are leading.</w:t>
       </w:r>
     </w:p>
     <w:p>
@@ -116,7 +116,7 @@
         <w:spacing w:after="40"/>
       </w:pPr>
       <w:r>
-        <w:t>I currently process and clear high-volume transactions daily at Office Depot, adhering to established routines and standard operating procedures while maintaining the highest standards of production and accuracy. I manage daily register reconciliation, cash handling, and inventory control by extracting data and inputting it into digital tracking systems — reducing cash discrepancies by 15% and stockouts by 10%. This is the same discipline required for extracting checks and remittances from envelopes, inputting data into systems, and maintaining accuracy under production pressure.</w:t>
+        <w:t>I have a CPA license in Arkansas and Louisiana, a Juris Doctor from the University of Arkansas, and a Bachelor of Accountancy from Ole Miss. My background is three years of processing, clearing, and servicing document transactions involving moderately complex tasks in environments where a single error disqualified an entire file — the same zero-error production and accuracy standards your custody and collateral review teams operate under.</w:t>
       </w:r>
     </w:p>
     <w:p>
@@ -129,7 +129,7 @@
         <w:spacing w:after="40"/>
       </w:pPr>
       <w:r>
-        <w:t>Previously, as an Accountant at Little and Associates, LLC, I processed and cleared document transactions across LIHTC, HUD, and GAAP regulatory frameworks where a single discrepancy disqualified an entire project file. I built parallel reconciliation models to track financial data sets, managed comprehensive audit fieldwork including GAAP-compliant adjustments and HUD-tailored supplemental schedules, and maintained up-to-date knowledge of market products and industry regulations — applying that knowledge to ensure compliance in all transaction and submission activities.</w:t>
+        <w:t>As an Accountant at Little and Associates, LLC from 2020 to 2023, I processed and cleared document transactions across LIHTC, HUD, and GAAP regulatory frameworks, adhering to established routines and procedures while maintaining zero-error accuracy. I built parallel reconciliation models to extract, input, and track comprehensive financial data sets — reconciling cumulative construction draws and recommending variance-correcting adjustments. I maintained up-to-date knowledge of market products and industry regulations, applying that knowledge to ensure compliance in all transaction and submission activities.</w:t>
       </w:r>
     </w:p>
     <w:p>
@@ -142,7 +142,7 @@
         <w:spacing w:after="40"/>
       </w:pPr>
       <w:r>
-        <w:t>I am experienced handling customer inquiries and requests, providing a positive customer experience at all touchpoints. I escalate non-routine issues to senior team members by applying common sense and experience of similar situations to identify potential solutions — an approach that reduced service disruptions by 20% in my most recent operations role. I am also developing proficiency in AI and automation tools to optimize transaction processes, and I am eager to contribute to JPMorgan Chase's innovation efforts as the firm scales toward 1,000+ AI use cases through tools like the LLM Suite.</w:t>
+        <w:t>Most recently, I managed operations and logistics at Bayou DeSiard Country Club in 2025, where I handled customer inquiries and requests across departments, providing a positive experience at all touchpoints. I escalated non-routine issues to senior team members by applying common sense and experience of similar situations to identify potential solutions — reducing service disruptions by 20%. I also managed daily equipment inventory and supply tracking, reducing shortages through the same disciplined extraction, input, and record-keeping that transaction processing demands.</w:t>
       </w:r>
     </w:p>
     <w:p>
@@ -155,7 +155,7 @@
         <w:spacing w:after="40"/>
       </w:pPr>
       <w:r>
-        <w:t>I know the Monroe campus has more than 1,000 employees supporting Chase customers across the country, with mortgage servicing accounting for roughly 75% of the business and the remainder in consumer originations and auto financing. With the new $31 million Ruston Operations Center now open — North Louisiana's only rural hub for a firm of this scale, as you noted at the groundbreaking — it is clear Chase is committed to growing custody and collateral review capacity in this region. Your partnership with Ascent to remove barriers to career opportunities and the "Home in Monroe" initiative to battle blight and boost homeownership tell me this is a company that invests in the community it operates in, not just the operation itself. I want to be part of both.</w:t>
+        <w:t>I know your Monroe campus has more than 1,000 employees supporting Chase customers nationwide, with mortgage servicing at roughly 75% of the business. I know the Ruston center opened in November with 50 employees and room for 200, handling recording, archiving, and custodial services for home loans, auto loans, and securities — with a vault taking up a large portion of the facility. And I know you are personally invested in this region beyond operations: your partnership with Ascent to remove barriers to career opportunities for young people, the $110,000 "Home in Monroe" initiative you launched with Mount Pleasant CDC and Southern University to battle blight and build a pipeline of affordable housing developers, and your team's work with United Way and Bethune-Oak Park Elementary. That is the kind of leadership I want to work under.</w:t>
       </w:r>
     </w:p>
     <w:p>
@@ -168,7 +168,7 @@
         <w:spacing w:after="40"/>
       </w:pPr>
       <w:r>
-        <w:t>I am local, available immediately, and comfortable with the physical requirements of the role. I would welcome the chance to discuss how my background in document transactions, compliance, and high-volume processing fits your team.</w:t>
+        <w:t>You went from a Health Information degree at Louisiana Tech to Executive Director to Managing Director running a 1,000-person campus and a $31 million expansion — as a Simsboro native, in your own backyard. That career path tells me you value people who show up, do the work, and grow. I am ready to do exactly that.</w:t>
       </w:r>
     </w:p>
     <w:p>
@@ -181,7 +181,20 @@
         <w:spacing w:after="40"/>
       </w:pPr>
       <w:r>
-        <w:t>Thank you for your consideration.</w:t>
+        <w:t>I am local, available immediately, and comfortable with the physical requirements of the role. I would welcome the chance to discuss how my background fits your team.</w:t>
+      </w:r>
+    </w:p>
+    <w:p>
+      <w:pPr>
+        <w:spacing w:after="40"/>
+      </w:pPr>
+    </w:p>
+    <w:p>
+      <w:pPr>
+        <w:spacing w:after="40"/>
+      </w:pPr>
+      <w:r>
+        <w:t>Thank you for your time.</w:t>
       </w:r>
     </w:p>
     <w:p>

</xml_diff>